<commit_message>
Plan Pollería F2: revisión adversarial (0 B · 2 M · 16 m; mayores arreglados, cifras sin mover)
Via: Claude Code
Co-Authored-By: Claude Opus 5.5 <noreply@anthropic.com>
</commit_message>
<xml_diff>
--- a/astro-site/public/dl/plan-negocio-polleria/plan-de-negocio-polleria.docx
+++ b/astro-site/public/dl/plan-negocio-polleria/plan-de-negocio-polleria.docx
@@ -335,7 +335,7 @@
     </w:p>
     <w:p>
       <w:r>
-        <w:t>El equipo es corto y se apoya en ti. Eres el maestro asador y llevas el asador cada día; te acompañan un segundo asador-cocinero, un dependiente de mostrador y caja, un camarero de sala, un ayudante de fin de semana y un refuerzo de festivos, en una plantilla de 7 personas que suman 4,60 jornadas completas. El kit incluye este plan de diez secciones, el Excel de nueve hojas, el checklist de 80 tareas, la calculadora del pollo y la guía de equivalencias. Lo que lo distingue son el pollo y el asador con números: 60 pollos por tanda (la carga que entra a la vez) y 180 asados antes de las tres del domingo en el ejemplo, estimaciones que mides tú.</w:t>
+        <w:t>El equipo es corto y se apoya en ti. Eres el maestro asador y llevas el asador cada día; te acompañan un segundo asador-cocinero, un dependiente de mostrador y caja, un camarero de sala, un ayudante de fin de semana, un refuerzo de sábado, domingo y festivos y las suplencias de vacaciones, en una plantilla de 7 personas que suman 4,60 jornadas completas. El kit incluye este plan de diez secciones, el Excel de nueve hojas, el checklist de 80 tareas, la calculadora del pollo y la guía de equivalencias. Lo que lo distingue son el pollo y el asador con números: 60 pollos por tanda (la carga que entra a la vez) y 180 asados antes de las tres del domingo en el ejemplo, estimaciones que mides tú.</w:t>
       </w:r>
     </w:p>
     <w:p>
@@ -372,12 +372,12 @@
     </w:p>
     <w:p>
       <w:r>
-        <w:t>El ticket del caso es de 15,80 € por pedido y sin IVA, es decir, 17,43 € con IVA. Un pedido de mostrador (0,8 pollos, 0,85 raciones de patatas, algún extra, pan, salsas y bebida) suma unos 17,70 € con IVA; el de plataforma, unos 20,50 € con su precio más alto; y el cliente de sala, con el menú de cuarto o el medio a la brasa, algo para compartir, 1,1 bebidas y postre, unos 16,08 €. El driver del plan es el pedido, sea de mostrador, un encargo, de plataforma o un cliente sentado. La mezcla de ventas es de 90 % de comida y 10 % de bebida. Por canal, el mostrador y el encargo pesan un 61 % de las ventas, sin comisión; la plataforma, un 11 %, y la sala, un 28 %.</w:t>
+        <w:t>El ticket del caso es de 15,80 € por pedido y sin IVA, es decir, 17,43 € con IVA. Un pedido de mostrador (0,8 pollos, 0,85 raciones de patatas, algún extra, pan, salsas y bebida) suma unos 17,70 € con IVA; el de plataforma, unos 20,50 € con su precio más alto; y el cliente de sala, con el menú de cuarto o el medio a la brasa, algo para compartir, 1,1 bebidas y postre, unos 16,10 €. El driver del plan es el pedido, sea de mostrador, un encargo, de plataforma o un cliente sentado. La mezcla de ventas es de 90 % de comida y 10 % de bebida. Por canal, el mostrador y el encargo pesan un 61 % de las ventas, sin comisión; la plataforma, un 11 %, y la sala, un 28 %.</w:t>
       </w:r>
     </w:p>
     <w:p>
       <w:r>
-        <w:t>Un detalle que te ahorra un disgusto es decir bien qué eres. La propuesta es un pollo de asar de calibre fijo (1,3-1,6 kg), bien hecho y sondeado, encargos del domingo con hora, combos que dan el margen y una sala pequeña con el medio pollo a la brasa. Eso no es un broaster, que es pollo frito a presión, ni la tienda de pollo crudo. Tampoco prometas «sin gluten» si la freidora se comparte con las croquetas, ni uses sellos de origen como promesa.</w:t>
+        <w:t>Un detalle que te ahorra un disgusto es decir bien qué eres. La propuesta es un pollo de asar de calibre fijo (1,4-1,5 kg en canal), bien hecho y sondeado, encargos del domingo con hora, combos que dan el margen y una sala pequeña con el medio pollo a la brasa. Eso no es un broaster, que es pollo frito a presión, ni la tienda de pollo crudo. Tampoco prometas «sin gluten» si la freidora se comparte con las croquetas, ni uses sellos de origen como promesa.</w:t>
       </w:r>
     </w:p>
     <w:p>
@@ -409,12 +409,12 @@
     </w:p>
     <w:p>
       <w:r>
-        <w:t>Sobre precios, estas son cartas y guías leídas en 2026, con IVA y sin nombres. El asador español vende el pollo entero a 11-14 €: en Getxo, a 11 €; en Sevilla, de 12 a 14 € con patatas. El pollo al ast de Barcelona va de 13,90 a 20,50 €. La pollería peruana de Madrid cobra el medio con papas a 14,50-16 € y el entero con todo a 25,50-27 €. En las plataformas, cada pieza cuesta 1,50-2 € más. El caso se pone en 12,90 € el entero, dentro de la banda del asador español.</w:t>
+        <w:t>Sobre precios, estas son cartas y guías leídas en 2026, con IVA y sin nombres. El asador español vende el pollo entero a 11-14 €: en Getxo, a 11 €; en Sevilla, de 12 € solo a 14 € con patatas. El pollo al ast de Barcelona va de 13,90 a 20,50 €. La pollería peruana de Madrid cobra el medio con papas a 14,50-16 € y el entero con todo a 25,50-27 €. En las plataformas, cada pieza cuesta 1,50-2 € más. El caso se pone en 12,90 € el entero, dentro de la banda del asador español.</w:t>
       </w:r>
     </w:p>
     <w:p>
       <w:r>
-        <w:t>Con el Mes 1 en enero y en el orden del calendario, la venta sigue la estacionalidad, y aquí va al revés que en otros locales: el verano sube. Enero y febrero son los meses más flojos, un 7 % del año; julio y agosto, el pico, con un 9,6 y un 9,8 %, y diciembre repunta con los encargos de Nochebuena y Nochevieja. Entre el mejor mes y el peor hay un 40 %. La rampa del arranque cae sobre enero y febrero, y por eso el fondo de maniobra cuenta. En la costa el verano sube más, hasta un 35 %; en el centro de una gran ciudad agosto puede bajar: gira la fila de la Tesorería.</w:t>
+        <w:t>Con el Mes 1 en enero y en el orden del calendario, la venta sigue la estacionalidad, y aquí va al revés que en otros locales: el verano sube. Enero y febrero son los meses más flojos, un 7 % del año; julio y agosto, el pico, con un 9,6 y un 9,8 %, y diciembre repunta con los encargos de Nochebuena y Nochevieja. Entre el mejor mes y el peor hay un 40 %. La rampa del arranque cae sobre enero y febrero, y por eso el fondo de maniobra cuenta. En la costa el verano sube más, hasta un 35 %; en el centro de una gran ciudad agosto puede bajar: cambia los pesos de la fila de estacionalidad de la Tesorería.</w:t>
       </w:r>
     </w:p>
     <w:p>
@@ -518,7 +518,7 @@
     </w:p>
     <w:p>
       <w:r>
-        <w:t>La recogida en el mostrador no paga comisión, así que empújala con precio: un pequeño descuento al pedido que se recoge puede salir más barato que la comisión, y trae al cliente a tu puerta, donde ve el asador y puede pedir algo más. Haz la cuenta con tus números. En el reparto hay además un tema de producto: el pollo entero aguanta bien el viaje, pero las patatas fritas llegan blandas, así que en la plataforma van mejor las patatas asadas o al horno, y por eso el techo del plan es ese 11 % de las ventas. Reparto propio no hay en el plan: si algún día lo montas, que sea con los números de arriba delante.</w:t>
+        <w:t>La recogida en el mostrador no paga comisión, así que empújala con precio: un pequeño descuento al pedido que se recoge puede salir más barato que la comisión, y trae al cliente a tu puerta, donde ve el asador y puede pedir algo más. Haz la cuenta con tus números. En el reparto hay además un tema de producto: el pollo entero aguanta bien el viaje, pero las patatas fritas llegan blandas, así que en la plataforma van mejor las patatas asadas, y por eso el techo del plan es ese 11 % de las ventas. Reparto propio no hay en el plan: si algún día lo montas, que sea con los números de arriba delante.</w:t>
       </w:r>
     </w:p>
     <w:p>
@@ -545,7 +545,7 @@
     </w:p>
     <w:p>
       <w:r>
-        <w:t>El pollo manda en este asador de pollos (ojo, que en España «pollería» también es la tienda de pollo crudo; aquí hablamos de la que lo asa), y sus números se calculan, no se suponen. La calculadora del kit parte de un pollo de asar de 1,45 kg en canal, a 3,05 € el kilo sin IVA, más 0,13 € de sazón, aceite y sal: cuesta 4,55 €. Con un rendimiento del asado del 76 % salen unos 1,10 kg de pollo asado. El USDA da un 78 % para el pollo entero asado con piel, con un rango del 68 al 84 %, pero es un dato de horno, no de asador de espadas (las barras donde se ensartan los pollos). Vendido entero a 12,90 € con IVA, su food cost es un 38,8 % sobre el precio sin IVA, que son 11,73 €. Todo esto son estimaciones del kit, editables en la calculadora, y el precio del kilo es el que pagues tú. Pesa cinco pollos crudos y asados de la misma tanda (los pollos que entran a la vez en el asador) y lleva tu rendimiento a la hoja «Pollo» de la calculadora. Mide en el kit, recalcula en el plan.</w:t>
+        <w:t>El pollo manda en este asador de pollos, y sus números se calculan, no se suponen. La calculadora del kit parte de un pollo de asar de 1,45 kg en canal, a 3,05 € el kilo sin IVA, más 0,13 € de sazón, aceite y sal: cuesta 4,55 €. Con un rendimiento del asado del 76 % salen unos 1,10 kg de pollo asado. El USDA da un 78 % para el pollo entero asado con piel, con un rango del 68 al 84 %, pero es un dato de horno, no de asador de espadas. Vendido entero a 12,90 € con IVA, su food cost es un 38,8 % sobre el precio sin IVA, que son 11,73 €. Todo esto son estimaciones del kit, editables en la calculadora, y el precio del kilo es el que pagues tú. Pesa cinco pollos crudos y asados de la misma tanda y lleva tu rendimiento a la hoja «Pollo» de la calculadora. Mide en el kit, recalcula en el plan.</w:t>
       </w:r>
     </w:p>
     <w:p>
@@ -560,7 +560,7 @@
     </w:p>
     <w:p>
       <w:r>
-        <w:t>Hay una alternativa que el plan financiero no modela: la brasa de leña o carbón. El horno rotativo del pollo a la brasa peruano (el rotombo) y la parrilla de la churrasqueira portuguesa (pollo abierto a la parrilla de carbón, con piri-piri, una guindilla) piden además filtro de partículas en el conducto y no tienen precio publicado en España. Son variantes sin Excel, con más inversión y con una ordenanza que las admita. El caso hace el asador español y el medio pollo a la brasa al estilo peruano en el mismo asador de gas. Si te tienta la brasa por el sabor, compara las dos cuentas con presupuestos reales antes de firmar el local. La pollería peruana de sala con horno de brasa es otro negocio, el de la Guía Restaurante Peruano.</w:t>
+        <w:t>Hay una alternativa que el plan financiero no modela: la brasa de leña o carbón. El horno rotativo del pollo a la brasa peruano (el rotombo) y la parrilla de carbón de la churrasqueira portuguesa piden además filtro de partículas en el conducto y no tienen precio publicado en España. Son variantes sin Excel, con más inversión y con una ordenanza que las admita. El caso hace el asador español y el medio pollo a la brasa al estilo peruano en el mismo asador de gas. Si te tienta la brasa por el sabor, compara las dos cuentas con presupuestos reales antes de firmar el local. La pollería peruana de sala con horno de brasa es otro negocio, el de la Guía Restaurante Peruano.</w:t>
       </w:r>
     </w:p>
     <w:p>
@@ -634,7 +634,7 @@
     </w:p>
     <w:p>
       <w:r>
-        <w:t>Para abrir necesitas 142.176 €. Son 93.100 € de obra, conducto, asador, equipo y puesta en marcha, 2.400 € de fianza y 2.400 € de renta antes de abrir, que suman 97.900 € de compras sin el fondo, más 44.276 € de fondo de maniobra. El IVA de la inversión, 19.425 €, lo adelantas, así que la necesidad de caja llega a 161.601 €; cómo recuperarlo, confírmalo con tu gestoría. Se financia con 50.000 € propios y un préstamo de 112.000 € al 6 %, a 7 años con 1 año de carencia y una cuota anual de 22.777 €.</w:t>
+        <w:t>Para abrir necesitas 142.176 €. Son 93.100 € de obra, conducto, asador, equipo y puesta en marcha, 2.400 € de fianza y 2.400 € de renta antes de abrir, que suman 97.900 € de inversión sin el fondo, más 44.276 € de fondo de maniobra. El IVA de la inversión, 19.425 €, lo adelantas, así que la necesidad de caja llega a 161.601 €; cómo recuperarlo, confírmalo con tu gestoría. Se financia con 50.000 € propios y un préstamo de 112.000 € al 6 %, a 7 años con 1 año de carencia y una cuota anual de 22.777 €.</w:t>
       </w:r>
     </w:p>
     <w:p>
@@ -748,7 +748,7 @@
     </w:p>
     <w:p>
       <w:r>
-        <w:t>El sexto es hacer alioli, ensaladilla o cremas con huevo crudo: ovoproducto de establecimiento autorizado, a 8 °C o menos y con la hora anotada. El séptimo, envasar el domingo por la mañana sin la etiqueta completa, que pide ingredientes, alérgenos resaltados, peso, fecha y conservación. El octavo, olvidar los alérgenos del adobo: la soja y el gluten del sillao y de la cerveza negra. El noveno, cobrar al 10 % la cerveza y los refrescos azucarados para llevar, cuando van al 21 %. Es un error de tique que se repite cientos de veces al año, y se arregla con la configuración de la caja. Repasa con tu gestoría qué línea de la carta tributa a cada tipo antes de abrir.</w:t>
+        <w:t>El sexto es hacer alioli, ensaladilla o cremas con huevo crudo: ovoproducto de establecimiento autorizado, a 8 °C o menos y con la hora anotada. El séptimo, envasar el domingo por la mañana sin la etiqueta completa, que pide ingredientes, alérgenos resaltados, peso, fecha y conservación. El octavo, olvidar los alérgenos del adobo: la soja y el gluten del sillao y de la cerveza negra. El noveno, cobrar al 10 % la cerveza, el vino y los refrescos con azúcares o edulcorantes añadidos para llevar, cuando van al 21 %. Es un error de tique que se repite cientos de veces al año, y se arregla con la configuración de la caja. Repasa con tu gestoría qué línea de la carta tributa a cada tipo antes de abrir.</w:t>
       </w:r>
     </w:p>
     <w:p>

</xml_diff>